<commit_message>
fix: harden and verify contract workflow end to end
Co-authored-by: Cursor <cursoragent@cursor.com>
</commit_message>
<xml_diff>
--- a/server/contract-templates/v1/individual.docx
+++ b/server/contract-templates/v1/individual.docx
@@ -4616,6 +4616,114 @@
                 <w:sz w:val="20"/>
               </w:rPr>
               <w:t>ЖШШИР: {{tenantJshshir}}</w:t>
+            </w:r>
+          </w:p>
+          <w:p>
+            <w:pPr>
+              <w:pStyle w:val="TableParagraph"/>
+              <w:spacing w:before="4" w:line="220" w:lineRule="exact"/>
+              <w:ind w:left="-1"/>
+              <w:rPr>
+                <w:b/>
+                <w:sz w:val="20"/>
+              </w:rPr>
+            </w:pPr>
+            <w:r>
+              <w:rPr>
+                <w:b/>
+                <w:sz w:val="20"/>
+              </w:rPr>
+              <w:t>{{#showSelfEmployedBlock}}</w:t>
+            </w:r>
+          </w:p>
+          <w:p>
+            <w:pPr>
+              <w:pStyle w:val="TableParagraph"/>
+              <w:spacing w:before="4" w:line="220" w:lineRule="exact"/>
+              <w:ind w:left="-1"/>
+              <w:rPr>
+                <w:b/>
+                <w:sz w:val="20"/>
+              </w:rPr>
+            </w:pPr>
+            <w:r>
+              <w:rPr>
+                <w:b/>
+                <w:sz w:val="20"/>
+              </w:rPr>
+              <w:t>СТИР: {{tenantStir}}</w:t>
+            </w:r>
+          </w:p>
+          <w:p>
+            <w:pPr>
+              <w:pStyle w:val="TableParagraph"/>
+              <w:spacing w:before="4" w:line="220" w:lineRule="exact"/>
+              <w:ind w:left="-1"/>
+              <w:rPr>
+                <w:b/>
+                <w:sz w:val="20"/>
+              </w:rPr>
+            </w:pPr>
+            <w:r>
+              <w:rPr>
+                <w:b/>
+                <w:sz w:val="20"/>
+              </w:rPr>
+              <w:t>Банк: {{tenantBankName}}</w:t>
+            </w:r>
+          </w:p>
+          <w:p>
+            <w:pPr>
+              <w:pStyle w:val="TableParagraph"/>
+              <w:spacing w:before="4" w:line="220" w:lineRule="exact"/>
+              <w:ind w:left="-1"/>
+              <w:rPr>
+                <w:b/>
+                <w:sz w:val="20"/>
+              </w:rPr>
+            </w:pPr>
+            <w:r>
+              <w:rPr>
+                <w:b/>
+                <w:sz w:val="20"/>
+              </w:rPr>
+              <w:t>МФО: {{tenantMfo}}</w:t>
+            </w:r>
+          </w:p>
+          <w:p>
+            <w:pPr>
+              <w:pStyle w:val="TableParagraph"/>
+              <w:spacing w:before="4" w:line="220" w:lineRule="exact"/>
+              <w:ind w:left="-1"/>
+              <w:rPr>
+                <w:b/>
+                <w:sz w:val="20"/>
+              </w:rPr>
+            </w:pPr>
+            <w:r>
+              <w:rPr>
+                <w:b/>
+                <w:sz w:val="20"/>
+              </w:rPr>
+              <w:t>Х/р: {{tenantAccountNumber}}</w:t>
+            </w:r>
+          </w:p>
+          <w:p>
+            <w:pPr>
+              <w:pStyle w:val="TableParagraph"/>
+              <w:spacing w:before="4" w:line="220" w:lineRule="exact"/>
+              <w:ind w:left="-1"/>
+              <w:rPr>
+                <w:b/>
+                <w:sz w:val="20"/>
+              </w:rPr>
+            </w:pPr>
+            <w:r>
+              <w:rPr>
+                <w:b/>
+                <w:sz w:val="20"/>
+              </w:rPr>
+              <w:t>{{/showSelfEmployedBlock}}</w:t>
             </w:r>
           </w:p>
         </w:tc>

</xml_diff>